<commit_message>
SACC: extended searches, new studies, duplicate extraction, GRADE, full Discussion
- Europe PMC and Crossref searches; Ge 2023, Zhou 2025, Pan 2022 (preprints) and
  Wang M 2014 (KoreaScience OA) added; Liu 2013 excluded at full text
- Independent blinded second extraction and NOS assessment, adjudicated
  (data/ADJUDICATION_LOG.md, data/second_extraction/)
- GRADE ratings (grade.csv, Table S4b); preprint-exclusion sensitivity analysis
- Manuscript completed: Methods as performed, Results, Discussion, Conclusion,
  AI-use disclosure; all 60 references verified against PubMed/Crossref;
  only author-supplied fields remain

Co-Authored-By: Claude Opus 5.5 <noreply@anthropic.com>
Claude-Session: https://claude.ai/code/session_01XrDQ7K98S3Gz9dRtKKNUgh
</commit_message>
<xml_diff>
--- a/sacc-meta-analysis/manuscript/Cover_Letter.docx
+++ b/sacc-meta-analysis/manuscript/Cover_Letter.docx
@@ -20,8 +20,9 @@
           <w:b w:val="0"/>
           <w:i w:val="0"/>
           <w:sz w:val="24"/>
+          <w:highlight w:val="yellow"/>
         </w:rPr>
-        <w:t>[Date]</w:t>
+        <w:t>[AUTHOR INPUT: date]</w:t>
       </w:r>
     </w:p>
     <w:p>
@@ -78,17 +79,7 @@
           <w:i w:val="0"/>
           <w:sz w:val="24"/>
         </w:rPr>
-        <w:t xml:space="preserve"> remains endemic in the Philippines, yet it is unclear whether colorectal cancers arising in patients with schistosomiasis behave differently from other colorectal cancers. Our study synthesises the comparative evidence on demographic, pathological, molecular, and survival features of schistosomiasis-associated colorectal cancer, with explicit handling of overlapping hospital cohorts and separation of adjusted and unadjusted survival estimates. </w:t>
-      </w:r>
-      <w:r>
-        <w:rPr>
-          <w:rFonts w:ascii="Arial" w:hAnsi="Arial" w:eastAsia="Arial"/>
-          <w:b w:val="0"/>
-          <w:i w:val="0"/>
-          <w:sz w:val="24"/>
-          <w:highlight w:val="yellow"/>
-        </w:rPr>
-        <w:t>[Principal findings TO BE ADDED in one or two sentences after analysis.]</w:t>
+        <w:t xml:space="preserve"> remains endemic in the Philippines, yet it is unclear whether colorectal cancers arising in patients with schistosomiasis behave differently from other colorectal cancers. Our review synthesises ten independent comparative cohorts, with explicit resolution of overlapping hospital reports, duplicate data extraction, and separation of adjusted and unadjusted survival estimates. We found that patients with schistosomiasis-associated colorectal cancer are consistently older and more often male, but that their tumours do not differ reproducibly in stage, nodal or distant spread, or histopathology; multivariable-adjusted estimates suggest poorer overall survival, with very low certainty.</w:t>
       </w:r>
     </w:p>
     <w:p>
@@ -99,7 +90,7 @@
           <w:i w:val="0"/>
           <w:sz w:val="24"/>
         </w:rPr>
-        <w:t>The findings are relevant to pathologists, surgeons, and oncologists in endemic regions of the Philippines, and the analysis identifies the absence of Philippine comparative cohorts as a research priority.</w:t>
+        <w:t>The findings are relevant to pathologists, surgeons, and oncologists in endemic regions of the Philippines: no Philippine comparative cohort exists, and we recommend routine recording of schistosome eggs in colorectal resection reports as the basis for such studies.</w:t>
       </w:r>
     </w:p>
     <w:p>
@@ -110,7 +101,45 @@
           <w:i w:val="0"/>
           <w:sz w:val="24"/>
         </w:rPr>
-        <w:t>This manuscript has not been published and is not under consideration elsewhere. All authors have approved the submission and declare [no conflicts of interest / conflicts as listed]. The protocol was [registered as ... / not registered].</w:t>
+        <w:t xml:space="preserve">This manuscript has not been published and is not under consideration elsewhere. All authors have approved the submission. </w:t>
+      </w:r>
+      <w:r>
+        <w:rPr>
+          <w:rFonts w:ascii="Arial" w:hAnsi="Arial" w:eastAsia="Arial"/>
+          <w:b w:val="0"/>
+          <w:i w:val="0"/>
+          <w:sz w:val="24"/>
+          <w:highlight w:val="yellow"/>
+        </w:rPr>
+        <w:t>[AUTHOR INPUT: conflicts of interest for each author, or 'The authors declare no conflicts of interest.']</w:t>
+      </w:r>
+      <w:r>
+        <w:rPr>
+          <w:rFonts w:ascii="Arial" w:hAnsi="Arial" w:eastAsia="Arial"/>
+          <w:b w:val="0"/>
+          <w:i w:val="0"/>
+          <w:sz w:val="24"/>
+        </w:rPr>
+        <w:t xml:space="preserve"> </w:t>
+      </w:r>
+      <w:r>
+        <w:rPr>
+          <w:rFonts w:ascii="Arial" w:hAnsi="Arial" w:eastAsia="Arial"/>
+          <w:b w:val="0"/>
+          <w:i w:val="0"/>
+          <w:sz w:val="24"/>
+          <w:highlight w:val="yellow"/>
+        </w:rPr>
+        <w:t>[AUTHOR INPUT: PROSPERO/OSF registration number and date, or the sentence 'The protocol was not registered.']</w:t>
+      </w:r>
+      <w:r>
+        <w:rPr>
+          <w:rFonts w:ascii="Arial" w:hAnsi="Arial" w:eastAsia="Arial"/>
+          <w:b w:val="0"/>
+          <w:i w:val="0"/>
+          <w:sz w:val="24"/>
+        </w:rPr>
+        <w:t xml:space="preserve"> An AI language model was used in searching, screening, data extraction, analysis coding, and drafting, as disclosed in the manuscript; the authors take full responsibility for the content.</w:t>
       </w:r>
     </w:p>
     <w:p>
@@ -125,7 +154,24 @@
         <w:br/>
         <w:t>Jayson Cagadas Pasaol, DVM, PhD</w:t>
         <w:br/>
-        <w:t>[Affiliation]</w:t>
+      </w:r>
+      <w:r>
+        <w:rPr>
+          <w:rFonts w:ascii="Arial" w:hAnsi="Arial" w:eastAsia="Arial"/>
+          <w:b w:val="0"/>
+          <w:i w:val="0"/>
+          <w:sz w:val="24"/>
+          <w:highlight w:val="yellow"/>
+        </w:rPr>
+        <w:t>[AUTHOR INPUT: department, institution, city, country]</w:t>
+      </w:r>
+      <w:r>
+        <w:rPr>
+          <w:rFonts w:ascii="Arial" w:hAnsi="Arial" w:eastAsia="Arial"/>
+          <w:b w:val="0"/>
+          <w:i w:val="0"/>
+          <w:sz w:val="24"/>
+        </w:rPr>
         <w:br/>
         <w:t>jaysonpasaolrmt082@gmail.com</w:t>
       </w:r>

</xml_diff>

<commit_message>
SACC: integrate supplied full texts, adjudicate second extraction, redesign Figure 7, finalise manuscript
- Extract Wang M 2016, NCG 1986, Zhang R 1998, Madbouly 2007, Zalata 2005; exclude Farid 2006 (no comparator)
- Exclude the five reports whose full text could not be obtained (Table S2 / PRISMA only)
- Blinded second extraction of the new reports adjudicated; NOS ratings updated
- Figures 4/5: heterogeneity text moved below each diamond (no overlap)
- Figure 7: domain-grouped evidence map with direction symbols, sample sizes and tallies
- Figure 1: identification box lists only searched sources
- Manuscript, supplement, GRADE, cover letter and highlights updated to the final data

Co-Authored-By: Claude Opus 5.5 <noreply@anthropic.com>
Claude-Session: https://claude.ai/code/session_01XrDQ7K98S3Gz9dRtKKNUgh
</commit_message>
<xml_diff>
--- a/sacc-meta-analysis/manuscript/Cover_Letter.docx
+++ b/sacc-meta-analysis/manuscript/Cover_Letter.docx
@@ -79,7 +79,43 @@
           <w:i w:val="0"/>
           <w:sz w:val="24"/>
         </w:rPr>
-        <w:t xml:space="preserve"> remains endemic in the Philippines, yet it is unclear whether colorectal cancers arising in patients with schistosomiasis behave differently from other colorectal cancers. Our review synthesises ten independent comparative cohorts, with explicit resolution of overlapping hospital reports, duplicate data extraction, and separation of adjusted and unadjusted survival estimates. We found that patients with schistosomiasis-associated colorectal cancer are consistently older and more often male, but that their tumours do not differ reproducibly in stage, nodal or distant spread, or histopathology; multivariable-adjusted estimates suggest poorer overall survival, with very low certainty.</w:t>
+        <w:t xml:space="preserve"> remains endemic in the Philippines, yet it is unclear whether colorectal cancers arising in patients with schistosomiasis behave differently from other colorectal cancers. Our review synthesises twelve independent </w:t>
+      </w:r>
+      <w:r>
+        <w:rPr>
+          <w:rFonts w:ascii="Arial" w:hAnsi="Arial" w:eastAsia="Arial"/>
+          <w:b w:val="0"/>
+          <w:i/>
+          <w:sz w:val="24"/>
+        </w:rPr>
+        <w:t>S. japonicum</w:t>
+      </w:r>
+      <w:r>
+        <w:rPr>
+          <w:rFonts w:ascii="Arial" w:hAnsi="Arial" w:eastAsia="Arial"/>
+          <w:b w:val="0"/>
+          <w:i w:val="0"/>
+          <w:sz w:val="24"/>
+        </w:rPr>
+        <w:t xml:space="preserve"> comparative cohorts and two </w:t>
+      </w:r>
+      <w:r>
+        <w:rPr>
+          <w:rFonts w:ascii="Arial" w:hAnsi="Arial" w:eastAsia="Arial"/>
+          <w:b w:val="0"/>
+          <w:i/>
+          <w:sz w:val="24"/>
+        </w:rPr>
+        <w:t>S. mansoni</w:t>
+      </w:r>
+      <w:r>
+        <w:rPr>
+          <w:rFonts w:ascii="Arial" w:hAnsi="Arial" w:eastAsia="Arial"/>
+          <w:b w:val="0"/>
+          <w:i w:val="0"/>
+          <w:sz w:val="24"/>
+        </w:rPr>
+        <w:t xml:space="preserve"> series, with explicit resolution of overlapping hospital reports, duplicate data extraction, and separation of adjusted and unadjusted survival estimates. We found that patients with schistosomiasis-associated colorectal cancer are consistently older and more often male, but that their tumours do not differ reproducibly in stage, nodal or distant spread, or histopathology; multivariable-adjusted estimates suggest poorer overall survival, with very low certainty.</w:t>
       </w:r>
     </w:p>
     <w:p>

</xml_diff>